<commit_message>
test/test 10 exceeded size
</commit_message>
<xml_diff>
--- a/tests/test case documentation.docx
+++ b/tests/test case documentation.docx
@@ -145,23 +145,7 @@
         <w:rPr>
           <w:lang w:val="en-US"/>
         </w:rPr>
-        <w:t xml:space="preserve"> The error occurs because the XSD uses the &lt;</w:t>
-      </w:r>
-      <w:proofErr w:type="spellStart"/>
-      <w:proofErr w:type="gramStart"/>
-      <w:r>
-        <w:rPr>
-          <w:lang w:val="en-US"/>
-        </w:rPr>
-        <w:t>xs:sequence</w:t>
-      </w:r>
-      <w:proofErr w:type="spellEnd"/>
-      <w:proofErr w:type="gramEnd"/>
-      <w:r>
-        <w:rPr>
-          <w:lang w:val="en-US"/>
-        </w:rPr>
-        <w:t>&gt; element to define the content model of the &lt;trial&gt;. This rule requires child tags to appear in the exact order they were declared in the schema. The validator expected to read &lt;contacts&gt; immediately after &lt;main&gt;, so encountering &lt;countries&gt; breaks the structural contract.</w:t>
+        <w:t xml:space="preserve"> The error occurs because the XSD uses the &lt;xs:sequence&gt; element to define the content model of the &lt;trial&gt;. This rule requires child tags to appear in the exact order they were declared in the schema. The validator expected to read &lt;contacts&gt; immediately after &lt;main&gt;, so encountering &lt;countries&gt; breaks the structural contract.</w:t>
       </w:r>
     </w:p>
     <w:p>
@@ -226,35 +210,7 @@
         <w:rPr>
           <w:lang w:val="en-US"/>
         </w:rPr>
-        <w:t>) inside the &lt;</w:t>
-      </w:r>
-      <w:proofErr w:type="spellStart"/>
-      <w:r>
-        <w:rPr>
-          <w:lang w:val="en-US"/>
-        </w:rPr>
-        <w:t>public_title</w:t>
-      </w:r>
-      <w:proofErr w:type="spellEnd"/>
-      <w:r>
-        <w:rPr>
-          <w:lang w:val="en-US"/>
-        </w:rPr>
-        <w:t>&gt; or &lt;</w:t>
-      </w:r>
-      <w:proofErr w:type="spellStart"/>
-      <w:r>
-        <w:rPr>
-          <w:lang w:val="en-US"/>
-        </w:rPr>
-        <w:t>inclusion_criteria</w:t>
-      </w:r>
-      <w:proofErr w:type="spellEnd"/>
-      <w:r>
-        <w:rPr>
-          <w:lang w:val="en-US"/>
-        </w:rPr>
-        <w:t>&gt; tag.</w:t>
+        <w:t>) inside the &lt;public_title&gt; or &lt;inclusion_criteria&gt; tag.</w:t>
       </w:r>
     </w:p>
     <w:p>
@@ -307,55 +263,7 @@
         <w:rPr>
           <w:lang w:val="en-US"/>
         </w:rPr>
-        <w:t xml:space="preserve"> This is allowed because the data type defined in the XSD for these fields is </w:t>
-      </w:r>
-      <w:proofErr w:type="spellStart"/>
-      <w:proofErr w:type="gramStart"/>
-      <w:r>
-        <w:rPr>
-          <w:lang w:val="en-US"/>
-        </w:rPr>
-        <w:t>xs:string</w:t>
-      </w:r>
-      <w:proofErr w:type="spellEnd"/>
-      <w:proofErr w:type="gramEnd"/>
-      <w:r>
-        <w:rPr>
-          <w:lang w:val="en-US"/>
-        </w:rPr>
-        <w:t xml:space="preserve">. The standard XML specification for </w:t>
-      </w:r>
-      <w:proofErr w:type="spellStart"/>
-      <w:proofErr w:type="gramStart"/>
-      <w:r>
-        <w:rPr>
-          <w:lang w:val="en-US"/>
-        </w:rPr>
-        <w:t>xs:string</w:t>
-      </w:r>
-      <w:proofErr w:type="spellEnd"/>
-      <w:proofErr w:type="gramEnd"/>
-      <w:r>
-        <w:rPr>
-          <w:lang w:val="en-US"/>
-        </w:rPr>
-        <w:t xml:space="preserve"> has no predefined character limit. Since the XSD did not impose a custom restriction (like an &lt;</w:t>
-      </w:r>
-      <w:proofErr w:type="spellStart"/>
-      <w:proofErr w:type="gramStart"/>
-      <w:r>
-        <w:rPr>
-          <w:lang w:val="en-US"/>
-        </w:rPr>
-        <w:t>xs:maxLength</w:t>
-      </w:r>
-      <w:proofErr w:type="spellEnd"/>
-      <w:proofErr w:type="gramEnd"/>
-      <w:r>
-        <w:rPr>
-          <w:lang w:val="en-US"/>
-        </w:rPr>
-        <w:t xml:space="preserve"> value="500"/&gt;), the system accepts any volume of text without throwing a validation error.</w:t>
+        <w:t xml:space="preserve"> This is allowed because the data type defined in the XSD for these fields is xs:string. The standard XML specification for xs:string has no predefined character limit. Since the XSD did not impose a custom restriction (like an &lt;xs:maxLength value="500"/&gt;), the system accepts any volume of text without throwing a validation error.</w:t>
       </w:r>
     </w:p>
     <w:p>
@@ -406,21 +314,7 @@
         <w:rPr>
           <w:lang w:val="en-US"/>
         </w:rPr>
-        <w:t xml:space="preserve"> Inside the &lt;main&gt; block, completely delete the &lt;</w:t>
-      </w:r>
-      <w:proofErr w:type="spellStart"/>
-      <w:r>
-        <w:rPr>
-          <w:lang w:val="en-US"/>
-        </w:rPr>
-        <w:t>primary_sponsor</w:t>
-      </w:r>
-      <w:proofErr w:type="spellEnd"/>
-      <w:r>
-        <w:rPr>
-          <w:lang w:val="en-US"/>
-        </w:rPr>
-        <w:t>&gt; tag and its content.</w:t>
+        <w:t xml:space="preserve"> Inside the &lt;main&gt; block, completely delete the &lt;primary_sponsor&gt; tag and its content.</w:t>
       </w:r>
     </w:p>
     <w:p>
@@ -470,21 +364,7 @@
         <w:rPr>
           <w:lang w:val="en-US"/>
         </w:rPr>
-        <w:t xml:space="preserve"> Element '</w:t>
-      </w:r>
-      <w:proofErr w:type="spellStart"/>
-      <w:r>
-        <w:rPr>
-          <w:lang w:val="en-US"/>
-        </w:rPr>
-        <w:t>public_title</w:t>
-      </w:r>
-      <w:proofErr w:type="spellEnd"/>
-      <w:r>
-        <w:rPr>
-          <w:lang w:val="en-US"/>
-        </w:rPr>
-        <w:t xml:space="preserve">': This element is not expected. </w:t>
+        <w:t xml:space="preserve"> Element 'public_title': This element is not expected. </w:t>
       </w:r>
       <w:r>
         <w:t>Expected is ( primary_sponsor ).</w:t>
@@ -512,49 +392,7 @@
         <w:rPr>
           <w:lang w:val="en-US"/>
         </w:rPr>
-        <w:t xml:space="preserve"> The validator reports an error on the next tag it reads (</w:t>
-      </w:r>
-      <w:proofErr w:type="spellStart"/>
-      <w:r>
-        <w:rPr>
-          <w:lang w:val="en-US"/>
-        </w:rPr>
-        <w:t>public_title</w:t>
-      </w:r>
-      <w:proofErr w:type="spellEnd"/>
-      <w:r>
-        <w:rPr>
-          <w:lang w:val="en-US"/>
-        </w:rPr>
-        <w:t>) because it notices the absence of &lt;</w:t>
-      </w:r>
-      <w:proofErr w:type="spellStart"/>
-      <w:r>
-        <w:rPr>
-          <w:lang w:val="en-US"/>
-        </w:rPr>
-        <w:t>primary_sponsor</w:t>
-      </w:r>
-      <w:proofErr w:type="spellEnd"/>
-      <w:r>
-        <w:rPr>
-          <w:lang w:val="en-US"/>
-        </w:rPr>
-        <w:t>&gt;. This happens because the &lt;</w:t>
-      </w:r>
-      <w:proofErr w:type="spellStart"/>
-      <w:r>
-        <w:rPr>
-          <w:lang w:val="en-US"/>
-        </w:rPr>
-        <w:t>primary_sponsor</w:t>
-      </w:r>
-      <w:proofErr w:type="spellEnd"/>
-      <w:r>
-        <w:rPr>
-          <w:lang w:val="en-US"/>
-        </w:rPr>
-        <w:t>&gt; tag was declared in the XSD without the minOccurs="0" attribute. By default, the absence of minOccurs means the element is mandatory (exactly 1 occurrence).</w:t>
+        <w:t xml:space="preserve"> The validator reports an error on the next tag it reads (public_title) because it notices the absence of &lt;primary_sponsor&gt;. This happens because the &lt;primary_sponsor&gt; tag was declared in the XSD without the minOccurs="0" attribute. By default, the absence of minOccurs means the element is mandatory (exactly 1 occurrence).</w:t>
       </w:r>
     </w:p>
     <w:p>
@@ -606,21 +444,7 @@
         <w:rPr>
           <w:lang w:val="en-US"/>
         </w:rPr>
-        <w:t xml:space="preserve"> Inside the &lt;main&gt; block, completely delete the &lt;acronym&gt; and &lt;</w:t>
-      </w:r>
-      <w:proofErr w:type="spellStart"/>
-      <w:r>
-        <w:rPr>
-          <w:lang w:val="en-US"/>
-        </w:rPr>
-        <w:t>hc_freetext</w:t>
-      </w:r>
-      <w:proofErr w:type="spellEnd"/>
-      <w:r>
-        <w:rPr>
-          <w:lang w:val="en-US"/>
-        </w:rPr>
-        <w:t>&gt; tags.</w:t>
+        <w:t xml:space="preserve"> Inside the &lt;main&gt; block, completely delete the &lt;acronym&gt; and &lt;hc_freetext&gt; tags.</w:t>
       </w:r>
     </w:p>
     <w:p>
@@ -673,21 +497,7 @@
         <w:rPr>
           <w:lang w:val="en-US"/>
         </w:rPr>
-        <w:t xml:space="preserve"> The file passes without errors because, in the XSD schema, these tags were explicitly configured with minOccurs="0". This tells the validation engine (Python's </w:t>
-      </w:r>
-      <w:proofErr w:type="spellStart"/>
-      <w:r>
-        <w:rPr>
-          <w:lang w:val="en-US"/>
-        </w:rPr>
-        <w:t>lxml</w:t>
-      </w:r>
-      <w:proofErr w:type="spellEnd"/>
-      <w:r>
-        <w:rPr>
-          <w:lang w:val="en-US"/>
-        </w:rPr>
-        <w:t>) that if the tag is not present in the sequence, it can simply skip to the next rule without invalidating the document.</w:t>
+        <w:t xml:space="preserve"> The file passes without errors because, in the XSD schema, these tags were explicitly configured with minOccurs="0". This tells the validation engine (Python's lxml) that if the tag is not present in the sequence, it can simply skip to the next rule without invalidating the document.</w:t>
       </w:r>
     </w:p>
     <w:p>
@@ -738,77 +548,7 @@
         <w:rPr>
           <w:lang w:val="en-US"/>
         </w:rPr>
-        <w:t xml:space="preserve"> Inside &lt;main&gt;, place two &lt;</w:t>
-      </w:r>
-      <w:proofErr w:type="spellStart"/>
-      <w:r>
-        <w:rPr>
-          <w:lang w:val="en-US"/>
-        </w:rPr>
-        <w:t>target_size</w:t>
-      </w:r>
-      <w:proofErr w:type="spellEnd"/>
-      <w:r>
-        <w:rPr>
-          <w:lang w:val="en-US"/>
-        </w:rPr>
-        <w:t>&gt; tags consecutively (e.g., &lt;</w:t>
-      </w:r>
-      <w:proofErr w:type="spellStart"/>
-      <w:r>
-        <w:rPr>
-          <w:lang w:val="en-US"/>
-        </w:rPr>
-        <w:t>target_size</w:t>
-      </w:r>
-      <w:proofErr w:type="spellEnd"/>
-      <w:r>
-        <w:rPr>
-          <w:lang w:val="en-US"/>
-        </w:rPr>
-        <w:t>&gt;100&lt;/</w:t>
-      </w:r>
-      <w:proofErr w:type="spellStart"/>
-      <w:r>
-        <w:rPr>
-          <w:lang w:val="en-US"/>
-        </w:rPr>
-        <w:t>target_size</w:t>
-      </w:r>
-      <w:proofErr w:type="spellEnd"/>
-      <w:r>
-        <w:rPr>
-          <w:lang w:val="en-US"/>
-        </w:rPr>
-        <w:t>&gt; &lt;</w:t>
-      </w:r>
-      <w:proofErr w:type="spellStart"/>
-      <w:r>
-        <w:rPr>
-          <w:lang w:val="en-US"/>
-        </w:rPr>
-        <w:t>target_size</w:t>
-      </w:r>
-      <w:proofErr w:type="spellEnd"/>
-      <w:r>
-        <w:rPr>
-          <w:lang w:val="en-US"/>
-        </w:rPr>
-        <w:t>&gt;200&lt;/</w:t>
-      </w:r>
-      <w:proofErr w:type="spellStart"/>
-      <w:r>
-        <w:rPr>
-          <w:lang w:val="en-US"/>
-        </w:rPr>
-        <w:t>target_size</w:t>
-      </w:r>
-      <w:proofErr w:type="spellEnd"/>
-      <w:r>
-        <w:rPr>
-          <w:lang w:val="en-US"/>
-        </w:rPr>
-        <w:t>&gt;).</w:t>
+        <w:t xml:space="preserve"> Inside &lt;main&gt;, place two &lt;target_size&gt; tags consecutively (e.g., &lt;target_size&gt;100&lt;/target_size&gt; &lt;target_size&gt;200&lt;/target_size&gt;).</w:t>
       </w:r>
     </w:p>
     <w:p>
@@ -858,21 +598,7 @@
         <w:rPr>
           <w:lang w:val="en-US"/>
         </w:rPr>
-        <w:t xml:space="preserve"> Element '</w:t>
-      </w:r>
-      <w:proofErr w:type="spellStart"/>
-      <w:r>
-        <w:rPr>
-          <w:lang w:val="en-US"/>
-        </w:rPr>
-        <w:t>target_size</w:t>
-      </w:r>
-      <w:proofErr w:type="spellEnd"/>
-      <w:r>
-        <w:rPr>
-          <w:lang w:val="en-US"/>
-        </w:rPr>
-        <w:t xml:space="preserve">': This element is not expected. </w:t>
+        <w:t xml:space="preserve"> Element 'target_size': This element is not expected. </w:t>
       </w:r>
       <w:r>
         <w:t>Expected is ( recruitment_status ).</w:t>
@@ -900,49 +626,7 @@
         <w:rPr>
           <w:lang w:val="en-US"/>
         </w:rPr>
-        <w:t xml:space="preserve"> The error occurs because, by default, tags have </w:t>
-      </w:r>
-      <w:proofErr w:type="spellStart"/>
-      <w:r>
-        <w:rPr>
-          <w:lang w:val="en-US"/>
-        </w:rPr>
-        <w:t>maxOccurs</w:t>
-      </w:r>
-      <w:proofErr w:type="spellEnd"/>
-      <w:r>
-        <w:rPr>
-          <w:lang w:val="en-US"/>
-        </w:rPr>
-        <w:t>="1". Upon reading the first &lt;</w:t>
-      </w:r>
-      <w:proofErr w:type="spellStart"/>
-      <w:r>
-        <w:rPr>
-          <w:lang w:val="en-US"/>
-        </w:rPr>
-        <w:t>target_size</w:t>
-      </w:r>
-      <w:proofErr w:type="spellEnd"/>
-      <w:r>
-        <w:rPr>
-          <w:lang w:val="en-US"/>
-        </w:rPr>
-        <w:t>&gt;, the quota for that tag is met. When the validator reads the second one, it was already expecting the next tag in the sequence (&lt;</w:t>
-      </w:r>
-      <w:proofErr w:type="spellStart"/>
-      <w:r>
-        <w:rPr>
-          <w:lang w:val="en-US"/>
-        </w:rPr>
-        <w:t>recruitment_status</w:t>
-      </w:r>
-      <w:proofErr w:type="spellEnd"/>
-      <w:r>
-        <w:rPr>
-          <w:lang w:val="en-US"/>
-        </w:rPr>
-        <w:t>&gt;), thus identifying the duplication as a structural violation.</w:t>
+        <w:t xml:space="preserve"> The error occurs because, by default, tags have maxOccurs="1". Upon reading the first &lt;target_size&gt;, the quota for that tag is met. When the validator reads the second one, it was already expecting the next tag in the sequence (&lt;recruitment_status&gt;), thus identifying the duplication as a structural violation.</w:t>
       </w:r>
     </w:p>
     <w:p>
@@ -1043,21 +727,7 @@
         <w:rPr>
           <w:lang w:val="en-US"/>
         </w:rPr>
-        <w:t xml:space="preserve"> The success occurs because the &lt;country2&gt; tag was configured in the XSD with </w:t>
-      </w:r>
-      <w:proofErr w:type="spellStart"/>
-      <w:r>
-        <w:rPr>
-          <w:lang w:val="en-US"/>
-        </w:rPr>
-        <w:t>maxOccurs</w:t>
-      </w:r>
-      <w:proofErr w:type="spellEnd"/>
-      <w:r>
-        <w:rPr>
-          <w:lang w:val="en-US"/>
-        </w:rPr>
-        <w:t>="unbounded". This creates a "list" relationship, notifying the validator that the element can be repeated infinitely within its parent element (&lt;countries&gt;), fulfilling the (country2+) requirement of the original DTD.</w:t>
+        <w:t xml:space="preserve"> The success occurs because the &lt;country2&gt; tag was configured in the XSD with maxOccurs="unbounded". This creates a "list" relationship, notifying the validator that the element can be repeated infinitely within its parent element (&lt;countries&gt;), fulfilling the (country2+) requirement of the original DTD.</w:t>
       </w:r>
     </w:p>
     <w:p>
@@ -1105,21 +775,7 @@
         <w:rPr>
           <w:lang w:val="en-US"/>
         </w:rPr>
-        <w:t xml:space="preserve"> In the &lt;</w:t>
-      </w:r>
-      <w:proofErr w:type="spellStart"/>
-      <w:r>
-        <w:rPr>
-          <w:lang w:val="en-US"/>
-        </w:rPr>
-        <w:t>target_size</w:t>
-      </w:r>
-      <w:proofErr w:type="spellEnd"/>
-      <w:r>
-        <w:rPr>
-          <w:lang w:val="en-US"/>
-        </w:rPr>
-        <w:t xml:space="preserve">&gt; tag (which represents the number of patients), type the words "One hundred patients" instead of the number "100". </w:t>
+        <w:t xml:space="preserve"> In the &lt;target_size&gt; tag (which represents the number of patients), type the words "One hundred patients" instead of the number "100". </w:t>
       </w:r>
       <w:r>
         <w:t>Similarly, in &lt;date_registration&gt;, type "Today".</w:t>
@@ -1176,55 +832,7 @@
         <w:rPr>
           <w:lang w:val="en-US"/>
         </w:rPr>
-        <w:t xml:space="preserve"> This is a critical behavior to document. The file will be considered valid because the current XSD defined these fields as type="</w:t>
-      </w:r>
-      <w:proofErr w:type="spellStart"/>
-      <w:proofErr w:type="gramStart"/>
-      <w:r>
-        <w:rPr>
-          <w:lang w:val="en-US"/>
-        </w:rPr>
-        <w:t>xs:string</w:t>
-      </w:r>
-      <w:proofErr w:type="spellEnd"/>
-      <w:proofErr w:type="gramEnd"/>
-      <w:r>
-        <w:rPr>
-          <w:lang w:val="en-US"/>
-        </w:rPr>
-        <w:t xml:space="preserve">" rather than </w:t>
-      </w:r>
-      <w:proofErr w:type="spellStart"/>
-      <w:proofErr w:type="gramStart"/>
-      <w:r>
-        <w:rPr>
-          <w:lang w:val="en-US"/>
-        </w:rPr>
-        <w:t>xs:integer</w:t>
-      </w:r>
-      <w:proofErr w:type="spellEnd"/>
-      <w:proofErr w:type="gramEnd"/>
-      <w:r>
-        <w:rPr>
-          <w:lang w:val="en-US"/>
-        </w:rPr>
-        <w:t xml:space="preserve"> or </w:t>
-      </w:r>
-      <w:proofErr w:type="spellStart"/>
-      <w:proofErr w:type="gramStart"/>
-      <w:r>
-        <w:rPr>
-          <w:lang w:val="en-US"/>
-        </w:rPr>
-        <w:t>xs:date</w:t>
-      </w:r>
-      <w:proofErr w:type="spellEnd"/>
-      <w:proofErr w:type="gramEnd"/>
-      <w:r>
-        <w:rPr>
-          <w:lang w:val="en-US"/>
-        </w:rPr>
-        <w:t xml:space="preserve">. The structural validator only checks if it is text. </w:t>
+        <w:t xml:space="preserve"> This is a critical behavior to document. The file will be considered valid because the current XSD defined these fields as type="xs:string" rather than xs:integer or xs:date. The structural validator only checks if it is text. </w:t>
       </w:r>
       <w:r>
         <w:rPr>
@@ -1303,35 +911,7 @@
         <w:rPr>
           <w:lang w:val="en-US"/>
         </w:rPr>
-        <w:t xml:space="preserve"> Alter a closing tag, for example, open &lt;</w:t>
-      </w:r>
-      <w:proofErr w:type="spellStart"/>
-      <w:r>
-        <w:rPr>
-          <w:lang w:val="en-US"/>
-        </w:rPr>
-        <w:t>public_title</w:t>
-      </w:r>
-      <w:proofErr w:type="spellEnd"/>
-      <w:r>
-        <w:rPr>
-          <w:lang w:val="en-US"/>
-        </w:rPr>
-        <w:t>&gt; but close it as &lt;/</w:t>
-      </w:r>
-      <w:proofErr w:type="spellStart"/>
-      <w:r>
-        <w:rPr>
-          <w:lang w:val="en-US"/>
-        </w:rPr>
-        <w:t>public_titl</w:t>
-      </w:r>
-      <w:proofErr w:type="spellEnd"/>
-      <w:r>
-        <w:rPr>
-          <w:lang w:val="en-US"/>
-        </w:rPr>
-        <w:t>&gt;.</w:t>
+        <w:t xml:space="preserve"> Alter a closing tag, for example, open &lt;public_title&gt; but close it as &lt;/public_titl&gt;.</w:t>
       </w:r>
     </w:p>
     <w:p>
@@ -1420,21 +1000,7 @@
         <w:rPr>
           <w:lang w:val="en-US"/>
         </w:rPr>
-        <w:t xml:space="preserve"> The error happens before it even reaches the XSD validation. Python's </w:t>
-      </w:r>
-      <w:proofErr w:type="spellStart"/>
-      <w:r>
-        <w:rPr>
-          <w:lang w:val="en-US"/>
-        </w:rPr>
-        <w:t>lxml</w:t>
-      </w:r>
-      <w:proofErr w:type="spellEnd"/>
-      <w:r>
-        <w:rPr>
-          <w:lang w:val="en-US"/>
-        </w:rPr>
-        <w:t xml:space="preserve"> parser fails when trying to build the document tree (parsing) because the file violated the universal "Well-Formedness" rules of the W3C for XML. A malformed file never even gets compared to the XSD.</w:t>
+        <w:t xml:space="preserve"> The error happens before it even reaches the XSD validation. Python's lxml parser fails when trying to build the document tree (parsing) because the file violated the universal "Well-Formedness" rules of the W3C for XML. A malformed file never even gets compared to the XSD.</w:t>
       </w:r>
     </w:p>
     <w:p>
@@ -1543,35 +1109,7 @@
         <w:rPr>
           <w:lang w:val="en-US"/>
         </w:rPr>
-        <w:t>Trial 3 has two simultaneous errors (missing the &lt;</w:t>
-      </w:r>
-      <w:proofErr w:type="spellStart"/>
-      <w:r>
-        <w:rPr>
-          <w:lang w:val="en-US"/>
-        </w:rPr>
-        <w:t>primary_sponsor</w:t>
-      </w:r>
-      <w:proofErr w:type="spellEnd"/>
-      <w:r>
-        <w:rPr>
-          <w:lang w:val="en-US"/>
-        </w:rPr>
-        <w:t>&gt; tag and has a duplicated &lt;</w:t>
-      </w:r>
-      <w:proofErr w:type="spellStart"/>
-      <w:r>
-        <w:rPr>
-          <w:lang w:val="en-US"/>
-        </w:rPr>
-        <w:t>target_size</w:t>
-      </w:r>
-      <w:proofErr w:type="spellEnd"/>
-      <w:r>
-        <w:rPr>
-          <w:lang w:val="en-US"/>
-        </w:rPr>
-        <w:t>&gt;).</w:t>
+        <w:t>Trial 3 has two simultaneous errors (missing the &lt;primary_sponsor&gt; tag and has a duplicated &lt;target_size&gt;).</w:t>
       </w:r>
     </w:p>
     <w:p>
@@ -1694,21 +1232,7 @@
         <w:rPr>
           <w:lang w:val="en-US"/>
         </w:rPr>
-        <w:t xml:space="preserve"> The app.py script first reads the large file and separates all &lt;trial&gt; blocks. It then starts a loop (for </w:t>
-      </w:r>
-      <w:proofErr w:type="spellStart"/>
-      <w:r>
-        <w:rPr>
-          <w:lang w:val="en-US"/>
-        </w:rPr>
-        <w:t>i</w:t>
-      </w:r>
-      <w:proofErr w:type="spellEnd"/>
-      <w:r>
-        <w:rPr>
-          <w:lang w:val="en-US"/>
-        </w:rPr>
-        <w:t xml:space="preserve">, trial in enumerate(trials):) validating them one by one. If Trial 1 fails, the </w:t>
+        <w:t xml:space="preserve"> The app.py script first reads the large file and separates all &lt;trial&gt; blocks. It then starts a loop (for i, trial in enumerate(trials):) validating them one by one. If Trial 1 fails, the </w:t>
       </w:r>
       <w:r>
         <w:rPr>
@@ -1728,23 +1252,13 @@
           <w:lang w:val="en-US"/>
         </w:rPr>
       </w:pPr>
-      <w:proofErr w:type="spellStart"/>
-      <w:r>
-        <w:rPr>
-          <w:b/>
-          <w:bCs/>
-          <w:lang w:val="en-US"/>
-        </w:rPr>
-        <w:t>lxml</w:t>
-      </w:r>
-      <w:proofErr w:type="spellEnd"/>
-      <w:r>
-        <w:rPr>
-          <w:b/>
-          <w:bCs/>
-          <w:lang w:val="en-US"/>
-        </w:rPr>
-        <w:t xml:space="preserve"> Error Logs:</w:t>
+      <w:r>
+        <w:rPr>
+          <w:b/>
+          <w:bCs/>
+          <w:lang w:val="en-US"/>
+        </w:rPr>
+        <w:t>lxml Error Logs:</w:t>
       </w:r>
       <w:r>
         <w:rPr>
@@ -1764,57 +1278,7 @@
         <w:rPr>
           <w:lang w:val="en-US"/>
         </w:rPr>
-        <w:t xml:space="preserve"> trial that has multiple errors (like Trial 3 in our example), the </w:t>
-      </w:r>
-      <w:proofErr w:type="spellStart"/>
-      <w:r>
-        <w:rPr>
-          <w:lang w:val="en-US"/>
-        </w:rPr>
-        <w:t>lxml</w:t>
-      </w:r>
-      <w:proofErr w:type="spellEnd"/>
-      <w:r>
-        <w:rPr>
-          <w:lang w:val="en-US"/>
-        </w:rPr>
-        <w:t xml:space="preserve"> package's XSD validator tries to continue validation as much as possible. It accumulates all structural errors found in the </w:t>
-      </w:r>
-      <w:proofErr w:type="spellStart"/>
-      <w:proofErr w:type="gramStart"/>
-      <w:r>
-        <w:rPr>
-          <w:lang w:val="en-US"/>
-        </w:rPr>
-        <w:t>schema.error</w:t>
-      </w:r>
-      <w:proofErr w:type="gramEnd"/>
-      <w:r>
-        <w:rPr>
-          <w:lang w:val="en-US"/>
-        </w:rPr>
-        <w:t>_log</w:t>
-      </w:r>
-      <w:proofErr w:type="spellEnd"/>
-      <w:r>
-        <w:rPr>
-          <w:lang w:val="en-US"/>
-        </w:rPr>
-        <w:t xml:space="preserve"> property. Our code iterates over this log (for e in </w:t>
-      </w:r>
-      <w:proofErr w:type="spellStart"/>
-      <w:r>
-        <w:rPr>
-          <w:lang w:val="en-US"/>
-        </w:rPr>
-        <w:t>error_log</w:t>
-      </w:r>
-      <w:proofErr w:type="spellEnd"/>
-      <w:r>
-        <w:rPr>
-          <w:lang w:val="en-US"/>
-        </w:rPr>
-        <w:t xml:space="preserve">:) and collects </w:t>
+        <w:t xml:space="preserve"> trial that has multiple errors (like Trial 3 in our example), the lxml package's XSD validator tries to continue validation as much as possible. It accumulates all structural errors found in the schema.error_log property. Our code iterates over this log (for e in error_log:) and collects </w:t>
       </w:r>
       <w:r>
         <w:rPr>
@@ -1829,6 +1293,135 @@
           <w:lang w:val="en-US"/>
         </w:rPr>
         <w:t xml:space="preserve"> lines where errors occurred for that trial, returning a complete report rather than just the first error it encountered.</w:t>
+      </w:r>
+    </w:p>
+    <w:p>
+      <w:pPr>
+        <w:rPr>
+          <w:b/>
+          <w:bCs/>
+          <w:lang w:val="en-US"/>
+        </w:rPr>
+      </w:pPr>
+      <w:r>
+        <w:rPr>
+          <w:rFonts w:ascii="Segoe UI Emoji" w:hAnsi="Segoe UI Emoji" w:cs="Segoe UI Emoji"/>
+          <w:b/>
+          <w:bCs/>
+          <w:lang w:val="en-US"/>
+        </w:rPr>
+        <w:t>❌</w:t>
+      </w:r>
+      <w:r>
+        <w:rPr>
+          <w:b/>
+          <w:bCs/>
+          <w:lang w:val="en-US"/>
+        </w:rPr>
+        <w:t xml:space="preserve"> Test 10: Exceeding Maximum Field Length (String Restriction)</w:t>
+      </w:r>
+    </w:p>
+    <w:p>
+      <w:pPr>
+        <w:numPr>
+          <w:ilvl w:val="0"/>
+          <w:numId w:val="19"/>
+        </w:numPr>
+        <w:rPr>
+          <w:lang w:val="en-US"/>
+        </w:rPr>
+      </w:pPr>
+      <w:r>
+        <w:rPr>
+          <w:b/>
+          <w:bCs/>
+          <w:lang w:val="en-US"/>
+        </w:rPr>
+        <w:t>Action:</w:t>
+      </w:r>
+      <w:r>
+        <w:rPr>
+          <w:lang w:val="en-US"/>
+        </w:rPr>
+        <w:t xml:space="preserve"> Insert a string that exceeds the maximum allowed characters for a specific field. For example, type more than 10 characters in the &lt;date_registration&gt; tag (e.g., &lt;date_registration&gt;13/03/2026-EXTRA&lt;/date_registration&gt;).</w:t>
+      </w:r>
+    </w:p>
+    <w:p>
+      <w:pPr>
+        <w:numPr>
+          <w:ilvl w:val="0"/>
+          <w:numId w:val="19"/>
+        </w:numPr>
+      </w:pPr>
+      <w:r>
+        <w:rPr>
+          <w:b/>
+          <w:bCs/>
+        </w:rPr>
+        <w:t>Expected Result:</w:t>
+      </w:r>
+      <w:r>
+        <w:t xml:space="preserve"> </w:t>
+      </w:r>
+      <w:r>
+        <w:rPr>
+          <w:b/>
+          <w:bCs/>
+        </w:rPr>
+        <w:t>Invalid</w:t>
+      </w:r>
+      <w:r>
+        <w:t xml:space="preserve"> (Error)</w:t>
+      </w:r>
+    </w:p>
+    <w:p>
+      <w:pPr>
+        <w:numPr>
+          <w:ilvl w:val="0"/>
+          <w:numId w:val="19"/>
+        </w:numPr>
+        <w:rPr>
+          <w:lang w:val="en-US"/>
+        </w:rPr>
+      </w:pPr>
+      <w:r>
+        <w:rPr>
+          <w:b/>
+          <w:bCs/>
+          <w:lang w:val="en-US"/>
+        </w:rPr>
+        <w:t>Predicted Error Message:</w:t>
+      </w:r>
+      <w:r>
+        <w:rPr>
+          <w:lang w:val="en-US"/>
+        </w:rPr>
+        <w:t xml:space="preserve"> Element 'date_registration': [facet 'maxLength'] The value '13/03/2026-EXTRA' has a length of '16'; this exceeds the allowed maximum length of '10'.</w:t>
+      </w:r>
+    </w:p>
+    <w:p>
+      <w:pPr>
+        <w:numPr>
+          <w:ilvl w:val="0"/>
+          <w:numId w:val="19"/>
+        </w:numPr>
+        <w:rPr>
+          <w:lang w:val="en-US"/>
+        </w:rPr>
+      </w:pPr>
+      <w:r>
+        <w:rPr>
+          <w:b/>
+          <w:bCs/>
+          <w:lang w:val="en-US"/>
+        </w:rPr>
+        <w:t>Behavior Explanation:</w:t>
+      </w:r>
+      <w:r>
+        <w:rPr>
+          <w:lang w:val="en-US"/>
+        </w:rPr>
+        <w:t xml:space="preserve"> The updated XSD now enforces specific length limits for each field based on the WHO ICTRP data dictionary by using &lt;xs:maxLength&gt; restrictions inside custom simpleTypes. When the text inside a tag exceeds its predefined limit (e.g., 10 characters for dates, 50 for names/countries, or 2000 for titles), the validator immediately rejects the file. This guarantees that the data will not be truncated and will fit perfectly into the database columns of the destination system.</w:t>
       </w:r>
     </w:p>
     <w:p>
@@ -2298,6 +1891,155 @@
     </w:lvl>
   </w:abstractNum>
   <w:abstractNum w:abstractNumId="3" w15:restartNumberingAfterBreak="0">
+    <w:nsid w:val="2F273A98"/>
+    <w:multiLevelType w:val="multilevel"/>
+    <w:tmpl w:val="3BC42864"/>
+    <w:lvl w:ilvl="0">
+      <w:start w:val="1"/>
+      <w:numFmt w:val="bullet"/>
+      <w:lvlText w:val=""/>
+      <w:lvlJc w:val="left"/>
+      <w:pPr>
+        <w:tabs>
+          <w:tab w:val="num" w:pos="720"/>
+        </w:tabs>
+        <w:ind w:left="720" w:hanging="360"/>
+      </w:pPr>
+      <w:rPr>
+        <w:rFonts w:ascii="Symbol" w:hAnsi="Symbol" w:hint="default"/>
+        <w:sz w:val="20"/>
+      </w:rPr>
+    </w:lvl>
+    <w:lvl w:ilvl="1" w:tentative="1">
+      <w:start w:val="1"/>
+      <w:numFmt w:val="bullet"/>
+      <w:lvlText w:val="o"/>
+      <w:lvlJc w:val="left"/>
+      <w:pPr>
+        <w:tabs>
+          <w:tab w:val="num" w:pos="1440"/>
+        </w:tabs>
+        <w:ind w:left="1440" w:hanging="360"/>
+      </w:pPr>
+      <w:rPr>
+        <w:rFonts w:ascii="Courier New" w:hAnsi="Courier New" w:hint="default"/>
+        <w:sz w:val="20"/>
+      </w:rPr>
+    </w:lvl>
+    <w:lvl w:ilvl="2" w:tentative="1">
+      <w:start w:val="1"/>
+      <w:numFmt w:val="bullet"/>
+      <w:lvlText w:val=""/>
+      <w:lvlJc w:val="left"/>
+      <w:pPr>
+        <w:tabs>
+          <w:tab w:val="num" w:pos="2160"/>
+        </w:tabs>
+        <w:ind w:left="2160" w:hanging="360"/>
+      </w:pPr>
+      <w:rPr>
+        <w:rFonts w:ascii="Wingdings" w:hAnsi="Wingdings" w:hint="default"/>
+        <w:sz w:val="20"/>
+      </w:rPr>
+    </w:lvl>
+    <w:lvl w:ilvl="3" w:tentative="1">
+      <w:start w:val="1"/>
+      <w:numFmt w:val="bullet"/>
+      <w:lvlText w:val=""/>
+      <w:lvlJc w:val="left"/>
+      <w:pPr>
+        <w:tabs>
+          <w:tab w:val="num" w:pos="2880"/>
+        </w:tabs>
+        <w:ind w:left="2880" w:hanging="360"/>
+      </w:pPr>
+      <w:rPr>
+        <w:rFonts w:ascii="Wingdings" w:hAnsi="Wingdings" w:hint="default"/>
+        <w:sz w:val="20"/>
+      </w:rPr>
+    </w:lvl>
+    <w:lvl w:ilvl="4" w:tentative="1">
+      <w:start w:val="1"/>
+      <w:numFmt w:val="bullet"/>
+      <w:lvlText w:val=""/>
+      <w:lvlJc w:val="left"/>
+      <w:pPr>
+        <w:tabs>
+          <w:tab w:val="num" w:pos="3600"/>
+        </w:tabs>
+        <w:ind w:left="3600" w:hanging="360"/>
+      </w:pPr>
+      <w:rPr>
+        <w:rFonts w:ascii="Wingdings" w:hAnsi="Wingdings" w:hint="default"/>
+        <w:sz w:val="20"/>
+      </w:rPr>
+    </w:lvl>
+    <w:lvl w:ilvl="5" w:tentative="1">
+      <w:start w:val="1"/>
+      <w:numFmt w:val="bullet"/>
+      <w:lvlText w:val=""/>
+      <w:lvlJc w:val="left"/>
+      <w:pPr>
+        <w:tabs>
+          <w:tab w:val="num" w:pos="4320"/>
+        </w:tabs>
+        <w:ind w:left="4320" w:hanging="360"/>
+      </w:pPr>
+      <w:rPr>
+        <w:rFonts w:ascii="Wingdings" w:hAnsi="Wingdings" w:hint="default"/>
+        <w:sz w:val="20"/>
+      </w:rPr>
+    </w:lvl>
+    <w:lvl w:ilvl="6" w:tentative="1">
+      <w:start w:val="1"/>
+      <w:numFmt w:val="bullet"/>
+      <w:lvlText w:val=""/>
+      <w:lvlJc w:val="left"/>
+      <w:pPr>
+        <w:tabs>
+          <w:tab w:val="num" w:pos="5040"/>
+        </w:tabs>
+        <w:ind w:left="5040" w:hanging="360"/>
+      </w:pPr>
+      <w:rPr>
+        <w:rFonts w:ascii="Wingdings" w:hAnsi="Wingdings" w:hint="default"/>
+        <w:sz w:val="20"/>
+      </w:rPr>
+    </w:lvl>
+    <w:lvl w:ilvl="7" w:tentative="1">
+      <w:start w:val="1"/>
+      <w:numFmt w:val="bullet"/>
+      <w:lvlText w:val=""/>
+      <w:lvlJc w:val="left"/>
+      <w:pPr>
+        <w:tabs>
+          <w:tab w:val="num" w:pos="5760"/>
+        </w:tabs>
+        <w:ind w:left="5760" w:hanging="360"/>
+      </w:pPr>
+      <w:rPr>
+        <w:rFonts w:ascii="Wingdings" w:hAnsi="Wingdings" w:hint="default"/>
+        <w:sz w:val="20"/>
+      </w:rPr>
+    </w:lvl>
+    <w:lvl w:ilvl="8" w:tentative="1">
+      <w:start w:val="1"/>
+      <w:numFmt w:val="bullet"/>
+      <w:lvlText w:val=""/>
+      <w:lvlJc w:val="left"/>
+      <w:pPr>
+        <w:tabs>
+          <w:tab w:val="num" w:pos="6480"/>
+        </w:tabs>
+        <w:ind w:left="6480" w:hanging="360"/>
+      </w:pPr>
+      <w:rPr>
+        <w:rFonts w:ascii="Wingdings" w:hAnsi="Wingdings" w:hint="default"/>
+        <w:sz w:val="20"/>
+      </w:rPr>
+    </w:lvl>
+  </w:abstractNum>
+  <w:abstractNum w:abstractNumId="4" w15:restartNumberingAfterBreak="0">
     <w:nsid w:val="307A6E9F"/>
     <w:multiLevelType w:val="multilevel"/>
     <w:tmpl w:val="1B7E01F2"/>
@@ -2446,7 +2188,7 @@
       </w:rPr>
     </w:lvl>
   </w:abstractNum>
-  <w:abstractNum w:abstractNumId="4" w15:restartNumberingAfterBreak="0">
+  <w:abstractNum w:abstractNumId="5" w15:restartNumberingAfterBreak="0">
     <w:nsid w:val="31D9216C"/>
     <w:multiLevelType w:val="multilevel"/>
     <w:tmpl w:val="ACA23FE0"/>
@@ -2595,7 +2337,7 @@
       </w:rPr>
     </w:lvl>
   </w:abstractNum>
-  <w:abstractNum w:abstractNumId="5" w15:restartNumberingAfterBreak="0">
+  <w:abstractNum w:abstractNumId="6" w15:restartNumberingAfterBreak="0">
     <w:nsid w:val="322A32FB"/>
     <w:multiLevelType w:val="multilevel"/>
     <w:tmpl w:val="10587702"/>
@@ -2744,7 +2486,7 @@
       </w:rPr>
     </w:lvl>
   </w:abstractNum>
-  <w:abstractNum w:abstractNumId="6" w15:restartNumberingAfterBreak="0">
+  <w:abstractNum w:abstractNumId="7" w15:restartNumberingAfterBreak="0">
     <w:nsid w:val="37EB60BF"/>
     <w:multiLevelType w:val="multilevel"/>
     <w:tmpl w:val="717E8E62"/>
@@ -2893,7 +2635,7 @@
       </w:rPr>
     </w:lvl>
   </w:abstractNum>
-  <w:abstractNum w:abstractNumId="7" w15:restartNumberingAfterBreak="0">
+  <w:abstractNum w:abstractNumId="8" w15:restartNumberingAfterBreak="0">
     <w:nsid w:val="3AA92319"/>
     <w:multiLevelType w:val="multilevel"/>
     <w:tmpl w:val="5000A842"/>
@@ -3042,7 +2784,7 @@
       </w:rPr>
     </w:lvl>
   </w:abstractNum>
-  <w:abstractNum w:abstractNumId="8" w15:restartNumberingAfterBreak="0">
+  <w:abstractNum w:abstractNumId="9" w15:restartNumberingAfterBreak="0">
     <w:nsid w:val="3C6A6712"/>
     <w:multiLevelType w:val="multilevel"/>
     <w:tmpl w:val="BE882214"/>
@@ -3191,7 +2933,7 @@
       </w:rPr>
     </w:lvl>
   </w:abstractNum>
-  <w:abstractNum w:abstractNumId="9" w15:restartNumberingAfterBreak="0">
+  <w:abstractNum w:abstractNumId="10" w15:restartNumberingAfterBreak="0">
     <w:nsid w:val="42BE3046"/>
     <w:multiLevelType w:val="multilevel"/>
     <w:tmpl w:val="70A85F8C"/>
@@ -3340,7 +3082,7 @@
       </w:rPr>
     </w:lvl>
   </w:abstractNum>
-  <w:abstractNum w:abstractNumId="10" w15:restartNumberingAfterBreak="0">
+  <w:abstractNum w:abstractNumId="11" w15:restartNumberingAfterBreak="0">
     <w:nsid w:val="534F3B28"/>
     <w:multiLevelType w:val="hybridMultilevel"/>
     <w:tmpl w:val="683057E0"/>
@@ -3485,7 +3227,7 @@
       </w:rPr>
     </w:lvl>
   </w:abstractNum>
-  <w:abstractNum w:abstractNumId="11" w15:restartNumberingAfterBreak="0">
+  <w:abstractNum w:abstractNumId="12" w15:restartNumberingAfterBreak="0">
     <w:nsid w:val="5796620D"/>
     <w:multiLevelType w:val="multilevel"/>
     <w:tmpl w:val="A0960278"/>
@@ -3634,7 +3376,7 @@
       </w:rPr>
     </w:lvl>
   </w:abstractNum>
-  <w:abstractNum w:abstractNumId="12" w15:restartNumberingAfterBreak="0">
+  <w:abstractNum w:abstractNumId="13" w15:restartNumberingAfterBreak="0">
     <w:nsid w:val="61D62A74"/>
     <w:multiLevelType w:val="multilevel"/>
     <w:tmpl w:val="D08639E0"/>
@@ -3783,7 +3525,7 @@
       </w:rPr>
     </w:lvl>
   </w:abstractNum>
-  <w:abstractNum w:abstractNumId="13" w15:restartNumberingAfterBreak="0">
+  <w:abstractNum w:abstractNumId="14" w15:restartNumberingAfterBreak="0">
     <w:nsid w:val="6BF27EA5"/>
     <w:multiLevelType w:val="multilevel"/>
     <w:tmpl w:val="A2E0DBA8"/>
@@ -3932,7 +3674,7 @@
       </w:rPr>
     </w:lvl>
   </w:abstractNum>
-  <w:abstractNum w:abstractNumId="14" w15:restartNumberingAfterBreak="0">
+  <w:abstractNum w:abstractNumId="15" w15:restartNumberingAfterBreak="0">
     <w:nsid w:val="6CDB5990"/>
     <w:multiLevelType w:val="multilevel"/>
     <w:tmpl w:val="64D231D0"/>
@@ -4081,7 +3823,7 @@
       </w:rPr>
     </w:lvl>
   </w:abstractNum>
-  <w:abstractNum w:abstractNumId="15" w15:restartNumberingAfterBreak="0">
+  <w:abstractNum w:abstractNumId="16" w15:restartNumberingAfterBreak="0">
     <w:nsid w:val="715A4ED3"/>
     <w:multiLevelType w:val="multilevel"/>
     <w:tmpl w:val="64CEC944"/>
@@ -4230,7 +3972,7 @@
       </w:rPr>
     </w:lvl>
   </w:abstractNum>
-  <w:abstractNum w:abstractNumId="16" w15:restartNumberingAfterBreak="0">
+  <w:abstractNum w:abstractNumId="17" w15:restartNumberingAfterBreak="0">
     <w:nsid w:val="7E152E00"/>
     <w:multiLevelType w:val="multilevel"/>
     <w:tmpl w:val="E8B61348"/>
@@ -4379,7 +4121,7 @@
       </w:rPr>
     </w:lvl>
   </w:abstractNum>
-  <w:abstractNum w:abstractNumId="17" w15:restartNumberingAfterBreak="0">
+  <w:abstractNum w:abstractNumId="18" w15:restartNumberingAfterBreak="0">
     <w:nsid w:val="7FA12256"/>
     <w:multiLevelType w:val="multilevel"/>
     <w:tmpl w:val="C9C64A88"/>
@@ -4529,58 +4271,61 @@
     </w:lvl>
   </w:abstractNum>
   <w:num w:numId="1" w16cid:durableId="1502433048">
-    <w:abstractNumId w:val="15"/>
+    <w:abstractNumId w:val="16"/>
   </w:num>
   <w:num w:numId="2" w16cid:durableId="1833715881">
-    <w:abstractNumId w:val="17"/>
+    <w:abstractNumId w:val="18"/>
   </w:num>
   <w:num w:numId="3" w16cid:durableId="14577805">
-    <w:abstractNumId w:val="4"/>
+    <w:abstractNumId w:val="5"/>
   </w:num>
   <w:num w:numId="4" w16cid:durableId="808859415">
     <w:abstractNumId w:val="2"/>
   </w:num>
   <w:num w:numId="5" w16cid:durableId="1798523081">
-    <w:abstractNumId w:val="8"/>
+    <w:abstractNumId w:val="9"/>
   </w:num>
   <w:num w:numId="6" w16cid:durableId="1902397159">
     <w:abstractNumId w:val="0"/>
   </w:num>
   <w:num w:numId="7" w16cid:durableId="2106265423">
-    <w:abstractNumId w:val="9"/>
+    <w:abstractNumId w:val="10"/>
   </w:num>
   <w:num w:numId="8" w16cid:durableId="451019349">
-    <w:abstractNumId w:val="13"/>
+    <w:abstractNumId w:val="14"/>
   </w:num>
   <w:num w:numId="9" w16cid:durableId="1675843609">
-    <w:abstractNumId w:val="6"/>
+    <w:abstractNumId w:val="7"/>
   </w:num>
   <w:num w:numId="10" w16cid:durableId="2125614512">
-    <w:abstractNumId w:val="16"/>
+    <w:abstractNumId w:val="17"/>
   </w:num>
   <w:num w:numId="11" w16cid:durableId="978001570">
     <w:abstractNumId w:val="1"/>
   </w:num>
   <w:num w:numId="12" w16cid:durableId="1275165755">
+    <w:abstractNumId w:val="13"/>
+  </w:num>
+  <w:num w:numId="13" w16cid:durableId="963583517">
+    <w:abstractNumId w:val="8"/>
+  </w:num>
+  <w:num w:numId="14" w16cid:durableId="560869496">
+    <w:abstractNumId w:val="15"/>
+  </w:num>
+  <w:num w:numId="15" w16cid:durableId="272173751">
+    <w:abstractNumId w:val="6"/>
+  </w:num>
+  <w:num w:numId="16" w16cid:durableId="9650872">
+    <w:abstractNumId w:val="4"/>
+  </w:num>
+  <w:num w:numId="17" w16cid:durableId="467673769">
     <w:abstractNumId w:val="12"/>
   </w:num>
-  <w:num w:numId="13" w16cid:durableId="963583517">
-    <w:abstractNumId w:val="7"/>
-  </w:num>
-  <w:num w:numId="14" w16cid:durableId="560869496">
-    <w:abstractNumId w:val="14"/>
-  </w:num>
-  <w:num w:numId="15" w16cid:durableId="272173751">
-    <w:abstractNumId w:val="5"/>
-  </w:num>
-  <w:num w:numId="16" w16cid:durableId="9650872">
-    <w:abstractNumId w:val="3"/>
-  </w:num>
-  <w:num w:numId="17" w16cid:durableId="467673769">
+  <w:num w:numId="18" w16cid:durableId="207112204">
     <w:abstractNumId w:val="11"/>
   </w:num>
-  <w:num w:numId="18" w16cid:durableId="207112204">
-    <w:abstractNumId w:val="10"/>
+  <w:num w:numId="19" w16cid:durableId="2061246393">
+    <w:abstractNumId w:val="3"/>
   </w:num>
 </w:numbering>
 </file>
@@ -5188,7 +4933,6 @@
   <w:style w:type="character" w:default="1" w:styleId="DefaultParagraphFont">
     <w:name w:val="Default Paragraph Font"/>
     <w:uiPriority w:val="1"/>
-    <w:semiHidden/>
     <w:unhideWhenUsed/>
   </w:style>
   <w:style w:type="table" w:default="1" w:styleId="TableNormal">

</xml_diff>